<commit_message>
Feat: Adding stocks data, to view all
</commit_message>
<xml_diff>
--- a/Stock Trading Simulation API.docx
+++ b/Stock Trading Simulation API.docx
@@ -1022,7 +1022,6 @@
         <w:rPr>
           <w:rFonts w:ascii="Calibri Light" w:hAnsi="Calibri Light" w:cs="Calibri Light"/>
         </w:rPr>
-        <w:lastRenderedPageBreak/>
         <w:t>🚀</w:t>
       </w:r>
       <w:r>
@@ -1078,6 +1077,7 @@
         </w:numPr>
       </w:pPr>
       <w:r>
+        <w:lastRenderedPageBreak/>
         <w:t xml:space="preserve">Add </w:t>
       </w:r>
       <w:proofErr w:type="spellStart"/>
@@ -1587,297 +1587,135 @@
     </w:p>
     <w:p>
       <w:pPr>
-        <w:pStyle w:val="Heading1"/>
-      </w:pPr>
-      <w:r>
-        <w:rPr>
-          <w:rFonts w:ascii="Calibri Light" w:hAnsi="Calibri Light" w:cs="Calibri Light"/>
-        </w:rPr>
-        <w:t>🏗</w:t>
-      </w:r>
-      <w:r>
-        <w:t xml:space="preserve"> Project Structure (Clean + Professional)</w:t>
+        <w:pStyle w:val="NormalWeb"/>
+      </w:pPr>
+      <w:r>
+        <w:t>Be ready to explain:</w:t>
       </w:r>
     </w:p>
     <w:p>
       <w:pPr>
-        <w:pStyle w:val="HTMLPreformatted"/>
-      </w:pPr>
-      <w:proofErr w:type="spellStart"/>
-      <w:r>
-        <w:t>StockTradingSystem</w:t>
-      </w:r>
-      <w:proofErr w:type="spellEnd"/>
-      <w:r>
-        <w:t>/</w:t>
-      </w:r>
-      <w:r>
-        <w:br/>
-        <w:t>├─ StockTradingSystem.API/          # ASP.NET Core Web API project</w:t>
-      </w:r>
-      <w:r>
-        <w:br/>
-        <w:t>│   ├─ Controllers/</w:t>
-      </w:r>
-      <w:r>
-        <w:br/>
-        <w:t xml:space="preserve">│   </w:t>
-      </w:r>
-      <w:proofErr w:type="spellStart"/>
-      <w:r>
-        <w:t>│</w:t>
-      </w:r>
-      <w:proofErr w:type="spellEnd"/>
-      <w:r>
-        <w:t xml:space="preserve">   └─ </w:t>
-      </w:r>
-      <w:proofErr w:type="spellStart"/>
-      <w:r>
-        <w:t>OrdersController.cs</w:t>
-      </w:r>
-      <w:proofErr w:type="spellEnd"/>
-      <w:r>
-        <w:br/>
-        <w:t xml:space="preserve">│   ├─ </w:t>
-      </w:r>
-      <w:proofErr w:type="spellStart"/>
-      <w:r>
-        <w:t>Program.cs</w:t>
-      </w:r>
-      <w:proofErr w:type="spellEnd"/>
-      <w:r>
-        <w:br/>
-        <w:t xml:space="preserve">│   └─ </w:t>
-      </w:r>
-      <w:proofErr w:type="spellStart"/>
-      <w:r>
-        <w:t>appsettings.json</w:t>
-      </w:r>
-      <w:proofErr w:type="spellEnd"/>
-      <w:r>
-        <w:br/>
-        <w:t xml:space="preserve">├─ </w:t>
-      </w:r>
-      <w:proofErr w:type="spellStart"/>
-      <w:r>
-        <w:t>StockTradingSystem.Domain</w:t>
-      </w:r>
-      <w:proofErr w:type="spellEnd"/>
-      <w:r>
-        <w:t>/</w:t>
-      </w:r>
-      <w:r>
-        <w:br/>
-        <w:t xml:space="preserve">│   ├─ </w:t>
-      </w:r>
-      <w:proofErr w:type="spellStart"/>
-      <w:r>
-        <w:t>Order.cs</w:t>
-      </w:r>
-      <w:proofErr w:type="spellEnd"/>
-      <w:r>
-        <w:br/>
-        <w:t xml:space="preserve">│   ├─ </w:t>
-      </w:r>
-      <w:proofErr w:type="spellStart"/>
-      <w:r>
-        <w:t>Trade.cs</w:t>
-      </w:r>
-      <w:proofErr w:type="spellEnd"/>
-      <w:r>
-        <w:br/>
-        <w:t xml:space="preserve">│   └─ </w:t>
-      </w:r>
-      <w:proofErr w:type="spellStart"/>
-      <w:r>
-        <w:t>OrderSide.cs</w:t>
-      </w:r>
-      <w:proofErr w:type="spellEnd"/>
-      <w:r>
-        <w:br/>
-        <w:t xml:space="preserve">├─ </w:t>
-      </w:r>
-      <w:proofErr w:type="spellStart"/>
-      <w:r>
-        <w:t>StockTradingSystem.Application</w:t>
-      </w:r>
-      <w:proofErr w:type="spellEnd"/>
-      <w:r>
-        <w:t>/</w:t>
-      </w:r>
-      <w:r>
-        <w:br/>
-        <w:t xml:space="preserve">│   ├─ </w:t>
-      </w:r>
-      <w:proofErr w:type="spellStart"/>
-      <w:r>
-        <w:t>IOrderBook.cs</w:t>
-      </w:r>
-      <w:proofErr w:type="spellEnd"/>
-      <w:r>
-        <w:br/>
-        <w:t xml:space="preserve">│   └─ </w:t>
-      </w:r>
-      <w:proofErr w:type="spellStart"/>
-      <w:r>
-        <w:t>IMatchingEngine.cs</w:t>
-      </w:r>
-      <w:proofErr w:type="spellEnd"/>
-      <w:r>
-        <w:br/>
-        <w:t xml:space="preserve">├─ </w:t>
-      </w:r>
-      <w:proofErr w:type="spellStart"/>
-      <w:r>
-        <w:t>StockTradingSystem.Infrastructure</w:t>
-      </w:r>
-      <w:proofErr w:type="spellEnd"/>
-      <w:r>
-        <w:t>/</w:t>
-      </w:r>
-      <w:r>
-        <w:br/>
-        <w:t xml:space="preserve">│   ├─ </w:t>
-      </w:r>
-      <w:proofErr w:type="spellStart"/>
-      <w:r>
-        <w:t>OrderBook.cs</w:t>
-      </w:r>
-      <w:proofErr w:type="spellEnd"/>
-      <w:r>
-        <w:br/>
-        <w:t xml:space="preserve">│   ├─ </w:t>
-      </w:r>
-      <w:proofErr w:type="spellStart"/>
-      <w:r>
-        <w:t>MatchingEngine.cs</w:t>
-      </w:r>
-      <w:proofErr w:type="spellEnd"/>
-      <w:r>
-        <w:br/>
-        <w:t xml:space="preserve">│   ├─ </w:t>
-      </w:r>
-      <w:proofErr w:type="spellStart"/>
-      <w:r>
-        <w:t>OrderProcessor.cs</w:t>
-      </w:r>
-      <w:proofErr w:type="spellEnd"/>
-      <w:r>
-        <w:br/>
-        <w:t xml:space="preserve">│   ├─ </w:t>
-      </w:r>
-      <w:proofErr w:type="spellStart"/>
-      <w:r>
-        <w:t>BackgroundOrderService.cs</w:t>
-      </w:r>
-      <w:proofErr w:type="spellEnd"/>
-      <w:r>
-        <w:br/>
-        <w:t xml:space="preserve">│   └─ </w:t>
-      </w:r>
-      <w:proofErr w:type="spellStart"/>
-      <w:r>
-        <w:t>SignalR</w:t>
-      </w:r>
-      <w:proofErr w:type="spellEnd"/>
-      <w:r>
-        <w:t xml:space="preserve"> Hub (</w:t>
-      </w:r>
-      <w:proofErr w:type="spellStart"/>
-      <w:r>
-        <w:t>MarketHub.cs</w:t>
-      </w:r>
-      <w:proofErr w:type="spellEnd"/>
-      <w:r>
-        <w:t>)</w:t>
-      </w:r>
-      <w:r>
-        <w:br/>
-        <w:t xml:space="preserve">├─ </w:t>
-      </w:r>
-      <w:proofErr w:type="spellStart"/>
-      <w:r>
-        <w:t>StockTradingSystem.Tests</w:t>
-      </w:r>
-      <w:proofErr w:type="spellEnd"/>
-      <w:r>
-        <w:t>/         # Unit &amp; concurrency tests</w:t>
-      </w:r>
-      <w:r>
-        <w:br/>
-        <w:t xml:space="preserve">├─ </w:t>
-      </w:r>
-      <w:proofErr w:type="spellStart"/>
-      <w:r>
-        <w:t>StockTradingSystem.Benchmarks</w:t>
-      </w:r>
-      <w:proofErr w:type="spellEnd"/>
-      <w:r>
-        <w:t xml:space="preserve">/   # </w:t>
-      </w:r>
-      <w:proofErr w:type="spellStart"/>
-      <w:r>
-        <w:t>BenchmarkDotNet</w:t>
-      </w:r>
-      <w:proofErr w:type="spellEnd"/>
-      <w:r>
-        <w:t xml:space="preserve"> tests</w:t>
-      </w:r>
-      <w:r>
-        <w:br/>
-        <w:t xml:space="preserve">└─ </w:t>
-      </w:r>
-      <w:proofErr w:type="spellStart"/>
-      <w:r>
-        <w:t>Dockerfile</w:t>
-      </w:r>
-      <w:proofErr w:type="spellEnd"/>
-      <w:r>
-        <w:t xml:space="preserve"> (optional for containerization)</w:t>
+        <w:pStyle w:val="NormalWeb"/>
+      </w:pPr>
+      <w:r>
+        <w:t>“How does your matching engine guarantee fairness?”</w:t>
       </w:r>
     </w:p>
     <w:p>
       <w:pPr>
-        <w:pStyle w:val="NormalWeb"/>
-      </w:pPr>
-      <w:r>
-        <w:lastRenderedPageBreak/>
-        <w:t>Be ready to explain:</w:t>
+        <w:spacing w:beforeAutospacing="1" w:after="100" w:afterAutospacing="1" w:line="240" w:lineRule="auto"/>
+        <w:rPr>
+          <w:rFonts w:ascii="Times New Roman" w:eastAsia="Times New Roman" w:hAnsi="Times New Roman" w:cs="Times New Roman"/>
+          <w:kern w:val="0"/>
+          <w:sz w:val="24"/>
+          <w:szCs w:val="24"/>
+          <w:lang w:val="en-US"/>
+        </w:rPr>
+      </w:pPr>
+      <w:r>
+        <w:rPr>
+          <w:rFonts w:ascii="Times New Roman" w:eastAsia="Times New Roman" w:hAnsi="Times New Roman" w:cs="Times New Roman"/>
+          <w:kern w:val="0"/>
+          <w:sz w:val="24"/>
+          <w:szCs w:val="24"/>
+          <w:lang w:val="en-US"/>
+        </w:rPr>
+        <w:t xml:space="preserve">Why did you move lock inside </w:t>
+      </w:r>
+      <w:proofErr w:type="spellStart"/>
+      <w:r>
+        <w:rPr>
+          <w:rFonts w:ascii="Times New Roman" w:eastAsia="Times New Roman" w:hAnsi="Times New Roman" w:cs="Times New Roman"/>
+          <w:kern w:val="0"/>
+          <w:sz w:val="24"/>
+          <w:szCs w:val="24"/>
+          <w:lang w:val="en-US"/>
+        </w:rPr>
+        <w:t>OrderBook</w:t>
+      </w:r>
+      <w:proofErr w:type="spellEnd"/>
+      <w:r>
+        <w:rPr>
+          <w:rFonts w:ascii="Times New Roman" w:eastAsia="Times New Roman" w:hAnsi="Times New Roman" w:cs="Times New Roman"/>
+          <w:kern w:val="0"/>
+          <w:sz w:val="24"/>
+          <w:szCs w:val="24"/>
+          <w:lang w:val="en-US"/>
+        </w:rPr>
+        <w:t>?</w:t>
       </w:r>
     </w:p>
     <w:p>
       <w:pPr>
-        <w:pStyle w:val="NormalWeb"/>
-      </w:pPr>
-      <w:r>
-        <w:t>“How does your matching engine guarantee fairness?”</w:t>
+        <w:spacing w:before="100" w:beforeAutospacing="1" w:after="100" w:afterAutospacing="1" w:line="240" w:lineRule="auto"/>
+        <w:rPr>
+          <w:rFonts w:ascii="Times New Roman" w:eastAsia="Times New Roman" w:hAnsi="Times New Roman" w:cs="Times New Roman"/>
+          <w:kern w:val="0"/>
+          <w:sz w:val="24"/>
+          <w:szCs w:val="24"/>
+          <w:lang w:val="en-US"/>
+        </w:rPr>
+      </w:pPr>
+      <w:r>
+        <w:rPr>
+          <w:rFonts w:ascii="Times New Roman" w:eastAsia="Times New Roman" w:hAnsi="Times New Roman" w:cs="Times New Roman"/>
+          <w:kern w:val="0"/>
+          <w:sz w:val="24"/>
+          <w:szCs w:val="24"/>
+          <w:lang w:val="en-US"/>
+        </w:rPr>
+        <w:t>You answer:</w:t>
+      </w:r>
+      <w:r>
+        <w:rPr>
+          <w:rFonts w:ascii="Times New Roman" w:eastAsia="Times New Roman" w:hAnsi="Times New Roman" w:cs="Times New Roman"/>
+          <w:kern w:val="0"/>
+          <w:sz w:val="24"/>
+          <w:szCs w:val="24"/>
+          <w:lang w:val="en-US"/>
+        </w:rPr>
+        <w:t xml:space="preserve"> </w:t>
+      </w:r>
+      <w:r>
+        <w:rPr>
+          <w:rFonts w:ascii="Times New Roman" w:eastAsia="Times New Roman" w:hAnsi="Times New Roman" w:cs="Times New Roman"/>
+          <w:kern w:val="0"/>
+          <w:sz w:val="24"/>
+          <w:szCs w:val="24"/>
+          <w:lang w:val="en-US"/>
+        </w:rPr>
+        <w:t>That’s senior-level thinking.</w:t>
       </w:r>
     </w:p>
     <w:p>
       <w:pPr>
-        <w:spacing w:beforeAutospacing="1" w:after="100" w:afterAutospacing="1" w:line="240" w:lineRule="auto"/>
-        <w:rPr>
-          <w:rFonts w:ascii="Times New Roman" w:eastAsia="Times New Roman" w:hAnsi="Times New Roman" w:cs="Times New Roman"/>
-          <w:kern w:val="0"/>
-          <w:sz w:val="24"/>
-          <w:szCs w:val="24"/>
-          <w:lang w:val="en-US"/>
-        </w:rPr>
-      </w:pPr>
-      <w:r>
-        <w:rPr>
-          <w:rFonts w:ascii="Times New Roman" w:eastAsia="Times New Roman" w:hAnsi="Times New Roman" w:cs="Times New Roman"/>
-          <w:kern w:val="0"/>
-          <w:sz w:val="24"/>
-          <w:szCs w:val="24"/>
-          <w:lang w:val="en-US"/>
-        </w:rPr>
-        <w:t xml:space="preserve">Why did you move lock inside </w:t>
+        <w:spacing w:before="100" w:beforeAutospacing="1" w:after="100" w:afterAutospacing="1" w:line="240" w:lineRule="auto"/>
+        <w:rPr>
+          <w:rFonts w:ascii="Times New Roman" w:eastAsia="Times New Roman" w:hAnsi="Times New Roman" w:cs="Times New Roman"/>
+          <w:color w:val="00B050"/>
+          <w:kern w:val="0"/>
+          <w:sz w:val="24"/>
+          <w:szCs w:val="24"/>
+          <w:lang w:val="en-US"/>
+        </w:rPr>
+      </w:pPr>
+      <w:proofErr w:type="gramStart"/>
+      <w:r>
+        <w:rPr>
+          <w:rFonts w:ascii="Times New Roman" w:eastAsia="Times New Roman" w:hAnsi="Times New Roman" w:cs="Times New Roman"/>
+          <w:color w:val="00B050"/>
+          <w:kern w:val="0"/>
+          <w:sz w:val="24"/>
+          <w:szCs w:val="24"/>
+          <w:lang w:val="en-US"/>
+        </w:rPr>
+        <w:t xml:space="preserve">"Because </w:t>
       </w:r>
       <w:proofErr w:type="spellStart"/>
       <w:r>
         <w:rPr>
           <w:rFonts w:ascii="Times New Roman" w:eastAsia="Times New Roman" w:hAnsi="Times New Roman" w:cs="Times New Roman"/>
+          <w:color w:val="00B050"/>
           <w:kern w:val="0"/>
           <w:sz w:val="24"/>
           <w:szCs w:val="24"/>
@@ -1889,122 +1727,33 @@
       <w:r>
         <w:rPr>
           <w:rFonts w:ascii="Times New Roman" w:eastAsia="Times New Roman" w:hAnsi="Times New Roman" w:cs="Times New Roman"/>
-          <w:kern w:val="0"/>
-          <w:sz w:val="24"/>
-          <w:szCs w:val="24"/>
-          <w:lang w:val="en-US"/>
-        </w:rPr>
-        <w:t>?</w:t>
+          <w:color w:val="00B050"/>
+          <w:kern w:val="0"/>
+          <w:sz w:val="24"/>
+          <w:szCs w:val="24"/>
+          <w:lang w:val="en-US"/>
+        </w:rPr>
+        <w:t xml:space="preserve"> owns the shared mutable state.</w:t>
+      </w:r>
+      <w:proofErr w:type="gramEnd"/>
+      <w:r>
+        <w:rPr>
+          <w:rFonts w:ascii="Times New Roman" w:eastAsia="Times New Roman" w:hAnsi="Times New Roman" w:cs="Times New Roman"/>
+          <w:color w:val="00B050"/>
+          <w:kern w:val="0"/>
+          <w:sz w:val="24"/>
+          <w:szCs w:val="24"/>
+          <w:lang w:val="en-US"/>
+        </w:rPr>
+        <w:t xml:space="preserve"> Exposing locking outside violates encapsulation and can cause inconsistent locking strategies."</w:t>
       </w:r>
     </w:p>
     <w:p>
       <w:pPr>
-        <w:spacing w:before="100" w:beforeAutospacing="1" w:after="100" w:afterAutospacing="1" w:line="240" w:lineRule="auto"/>
-        <w:rPr>
-          <w:rFonts w:ascii="Times New Roman" w:eastAsia="Times New Roman" w:hAnsi="Times New Roman" w:cs="Times New Roman"/>
-          <w:kern w:val="0"/>
-          <w:sz w:val="24"/>
-          <w:szCs w:val="24"/>
-          <w:lang w:val="en-US"/>
-        </w:rPr>
-      </w:pPr>
-      <w:r>
-        <w:rPr>
-          <w:rFonts w:ascii="Times New Roman" w:eastAsia="Times New Roman" w:hAnsi="Times New Roman" w:cs="Times New Roman"/>
-          <w:kern w:val="0"/>
-          <w:sz w:val="24"/>
-          <w:szCs w:val="24"/>
-          <w:lang w:val="en-US"/>
-        </w:rPr>
-        <w:t>You answer:</w:t>
-      </w:r>
-      <w:r>
-        <w:rPr>
-          <w:rFonts w:ascii="Times New Roman" w:eastAsia="Times New Roman" w:hAnsi="Times New Roman" w:cs="Times New Roman"/>
-          <w:kern w:val="0"/>
-          <w:sz w:val="24"/>
-          <w:szCs w:val="24"/>
-          <w:lang w:val="en-US"/>
-        </w:rPr>
-        <w:t xml:space="preserve"> </w:t>
-      </w:r>
-      <w:r>
-        <w:rPr>
-          <w:rFonts w:ascii="Times New Roman" w:eastAsia="Times New Roman" w:hAnsi="Times New Roman" w:cs="Times New Roman"/>
-          <w:kern w:val="0"/>
-          <w:sz w:val="24"/>
-          <w:szCs w:val="24"/>
-          <w:lang w:val="en-US"/>
-        </w:rPr>
-        <w:t>That’s senior-level thinking.</w:t>
-      </w:r>
-    </w:p>
-    <w:p>
-      <w:pPr>
-        <w:spacing w:before="100" w:beforeAutospacing="1" w:after="100" w:afterAutospacing="1" w:line="240" w:lineRule="auto"/>
-        <w:rPr>
-          <w:rFonts w:ascii="Times New Roman" w:eastAsia="Times New Roman" w:hAnsi="Times New Roman" w:cs="Times New Roman"/>
-          <w:color w:val="00B050"/>
-          <w:kern w:val="0"/>
-          <w:sz w:val="24"/>
-          <w:szCs w:val="24"/>
-          <w:lang w:val="en-US"/>
-        </w:rPr>
-      </w:pPr>
-      <w:proofErr w:type="gramStart"/>
-      <w:r>
-        <w:rPr>
-          <w:rFonts w:ascii="Times New Roman" w:eastAsia="Times New Roman" w:hAnsi="Times New Roman" w:cs="Times New Roman"/>
-          <w:color w:val="00B050"/>
-          <w:kern w:val="0"/>
-          <w:sz w:val="24"/>
-          <w:szCs w:val="24"/>
-          <w:lang w:val="en-US"/>
-        </w:rPr>
-        <w:t xml:space="preserve">"Because </w:t>
-      </w:r>
-      <w:proofErr w:type="spellStart"/>
-      <w:r>
-        <w:rPr>
-          <w:rFonts w:ascii="Times New Roman" w:eastAsia="Times New Roman" w:hAnsi="Times New Roman" w:cs="Times New Roman"/>
-          <w:color w:val="00B050"/>
-          <w:kern w:val="0"/>
-          <w:sz w:val="24"/>
-          <w:szCs w:val="24"/>
-          <w:lang w:val="en-US"/>
-        </w:rPr>
-        <w:t>OrderBook</w:t>
-      </w:r>
-      <w:proofErr w:type="spellEnd"/>
-      <w:r>
-        <w:rPr>
-          <w:rFonts w:ascii="Times New Roman" w:eastAsia="Times New Roman" w:hAnsi="Times New Roman" w:cs="Times New Roman"/>
-          <w:color w:val="00B050"/>
-          <w:kern w:val="0"/>
-          <w:sz w:val="24"/>
-          <w:szCs w:val="24"/>
-          <w:lang w:val="en-US"/>
-        </w:rPr>
-        <w:t xml:space="preserve"> owns the shared mutable state.</w:t>
-      </w:r>
-      <w:proofErr w:type="gramEnd"/>
-      <w:r>
-        <w:rPr>
-          <w:rFonts w:ascii="Times New Roman" w:eastAsia="Times New Roman" w:hAnsi="Times New Roman" w:cs="Times New Roman"/>
-          <w:color w:val="00B050"/>
-          <w:kern w:val="0"/>
-          <w:sz w:val="24"/>
-          <w:szCs w:val="24"/>
-          <w:lang w:val="en-US"/>
-        </w:rPr>
-        <w:t xml:space="preserve"> Exposing locking outside violates encapsulation and can cause inconsistent locking strategies."</w:t>
-      </w:r>
-    </w:p>
-    <w:p>
-      <w:pPr>
         <w:pStyle w:val="Heading1"/>
       </w:pPr>
       <w:r>
+        <w:lastRenderedPageBreak/>
         <w:t>6</w:t>
       </w:r>
       <w:r>
@@ -2060,298 +1809,508 @@
     </w:p>
     <w:p>
       <w:pPr>
-        <w:pStyle w:val="NormalWeb"/>
-      </w:pPr>
-      <w:r>
-        <w:t>Example JSON:</w:t>
+        <w:pStyle w:val="Heading1"/>
+        <w:rPr>
+          <w:rFonts w:ascii="Courier New" w:eastAsia="Times New Roman" w:hAnsi="Courier New" w:cs="Courier New"/>
+          <w:b w:val="0"/>
+          <w:bCs w:val="0"/>
+          <w:color w:val="auto"/>
+          <w:kern w:val="0"/>
+          <w:sz w:val="20"/>
+          <w:szCs w:val="20"/>
+          <w:lang w:val="en-US"/>
+        </w:rPr>
+      </w:pPr>
+      <w:r>
+        <w:rPr>
+          <w:rFonts w:ascii="Courier New" w:eastAsia="Times New Roman" w:hAnsi="Courier New" w:cs="Courier New"/>
+          <w:b w:val="0"/>
+          <w:bCs w:val="0"/>
+          <w:color w:val="auto"/>
+          <w:kern w:val="0"/>
+          <w:sz w:val="20"/>
+          <w:szCs w:val="20"/>
+          <w:lang w:val="en-US"/>
+        </w:rPr>
+        <w:t>{</w:t>
       </w:r>
     </w:p>
     <w:p>
       <w:pPr>
-        <w:pStyle w:val="NormalWeb"/>
-        <w:rPr>
-          <w:rFonts w:ascii="Courier New" w:hAnsi="Courier New" w:cs="Courier New"/>
+        <w:pStyle w:val="Heading1"/>
+        <w:rPr>
+          <w:rFonts w:ascii="Courier New" w:eastAsia="Times New Roman" w:hAnsi="Courier New" w:cs="Courier New"/>
+          <w:b w:val="0"/>
+          <w:bCs w:val="0"/>
+          <w:color w:val="auto"/>
+          <w:kern w:val="0"/>
           <w:sz w:val="20"/>
           <w:szCs w:val="20"/>
-        </w:rPr>
-      </w:pPr>
-      <w:r>
-        <w:rPr>
-          <w:rFonts w:ascii="Courier New" w:hAnsi="Courier New" w:cs="Courier New"/>
+          <w:lang w:val="en-US"/>
+        </w:rPr>
+      </w:pPr>
+      <w:r>
+        <w:rPr>
+          <w:rFonts w:ascii="Courier New" w:eastAsia="Times New Roman" w:hAnsi="Courier New" w:cs="Courier New"/>
+          <w:b w:val="0"/>
+          <w:bCs w:val="0"/>
+          <w:color w:val="auto"/>
+          <w:kern w:val="0"/>
           <w:sz w:val="20"/>
           <w:szCs w:val="20"/>
-        </w:rPr>
-        <w:t>{</w:t>
+          <w:lang w:val="en-US"/>
+        </w:rPr>
+        <w:t xml:space="preserve">  "</w:t>
+      </w:r>
+      <w:proofErr w:type="gramStart"/>
+      <w:r>
+        <w:rPr>
+          <w:rFonts w:ascii="Courier New" w:eastAsia="Times New Roman" w:hAnsi="Courier New" w:cs="Courier New"/>
+          <w:b w:val="0"/>
+          <w:bCs w:val="0"/>
+          <w:color w:val="auto"/>
+          <w:kern w:val="0"/>
+          <w:sz w:val="20"/>
+          <w:szCs w:val="20"/>
+          <w:lang w:val="en-US"/>
+        </w:rPr>
+        <w:t>id</w:t>
+      </w:r>
+      <w:proofErr w:type="gramEnd"/>
+      <w:r>
+        <w:rPr>
+          <w:rFonts w:ascii="Courier New" w:eastAsia="Times New Roman" w:hAnsi="Courier New" w:cs="Courier New"/>
+          <w:b w:val="0"/>
+          <w:bCs w:val="0"/>
+          <w:color w:val="auto"/>
+          <w:kern w:val="0"/>
+          <w:sz w:val="20"/>
+          <w:szCs w:val="20"/>
+          <w:lang w:val="en-US"/>
+        </w:rPr>
+        <w:t>": "3fa85f64-5717-4562-b3fc-2c963f66afa6",</w:t>
       </w:r>
     </w:p>
     <w:p>
       <w:pPr>
-        <w:pStyle w:val="NormalWeb"/>
-        <w:rPr>
-          <w:rFonts w:ascii="Courier New" w:hAnsi="Courier New" w:cs="Courier New"/>
+        <w:pStyle w:val="Heading1"/>
+        <w:rPr>
+          <w:rFonts w:ascii="Courier New" w:eastAsia="Times New Roman" w:hAnsi="Courier New" w:cs="Courier New"/>
+          <w:b w:val="0"/>
+          <w:bCs w:val="0"/>
+          <w:color w:val="auto"/>
+          <w:kern w:val="0"/>
           <w:sz w:val="20"/>
           <w:szCs w:val="20"/>
-        </w:rPr>
-      </w:pPr>
-      <w:r>
-        <w:rPr>
-          <w:rFonts w:ascii="Courier New" w:hAnsi="Courier New" w:cs="Courier New"/>
+          <w:lang w:val="en-US"/>
+        </w:rPr>
+      </w:pPr>
+      <w:r>
+        <w:rPr>
+          <w:rFonts w:ascii="Courier New" w:eastAsia="Times New Roman" w:hAnsi="Courier New" w:cs="Courier New"/>
+          <w:b w:val="0"/>
+          <w:bCs w:val="0"/>
+          <w:color w:val="auto"/>
+          <w:kern w:val="0"/>
           <w:sz w:val="20"/>
           <w:szCs w:val="20"/>
-        </w:rPr>
-        <w:t>"</w:t>
+          <w:lang w:val="en-US"/>
+        </w:rPr>
+        <w:t xml:space="preserve">  "</w:t>
       </w:r>
       <w:proofErr w:type="gramStart"/>
       <w:r>
         <w:rPr>
-          <w:rFonts w:ascii="Courier New" w:hAnsi="Courier New" w:cs="Courier New"/>
+          <w:rFonts w:ascii="Courier New" w:eastAsia="Times New Roman" w:hAnsi="Courier New" w:cs="Courier New"/>
+          <w:b w:val="0"/>
+          <w:bCs w:val="0"/>
+          <w:color w:val="auto"/>
+          <w:kern w:val="0"/>
           <w:sz w:val="20"/>
           <w:szCs w:val="20"/>
-        </w:rPr>
-        <w:t>order</w:t>
+          <w:lang w:val="en-US"/>
+        </w:rPr>
+        <w:t>symbol</w:t>
       </w:r>
       <w:proofErr w:type="gramEnd"/>
       <w:r>
         <w:rPr>
-          <w:rFonts w:ascii="Courier New" w:hAnsi="Courier New" w:cs="Courier New"/>
+          <w:rFonts w:ascii="Courier New" w:eastAsia="Times New Roman" w:hAnsi="Courier New" w:cs="Courier New"/>
+          <w:b w:val="0"/>
+          <w:bCs w:val="0"/>
+          <w:color w:val="auto"/>
+          <w:kern w:val="0"/>
           <w:sz w:val="20"/>
           <w:szCs w:val="20"/>
-        </w:rPr>
-        <w:t>": {</w:t>
+          <w:lang w:val="en-US"/>
+        </w:rPr>
+        <w:t>": "SWR",</w:t>
       </w:r>
     </w:p>
     <w:p>
       <w:pPr>
-        <w:pStyle w:val="NormalWeb"/>
-        <w:rPr>
-          <w:rFonts w:ascii="Courier New" w:hAnsi="Courier New" w:cs="Courier New"/>
+        <w:pStyle w:val="Heading1"/>
+        <w:rPr>
+          <w:rFonts w:ascii="Courier New" w:eastAsia="Times New Roman" w:hAnsi="Courier New" w:cs="Courier New"/>
+          <w:b w:val="0"/>
+          <w:bCs w:val="0"/>
+          <w:color w:val="auto"/>
+          <w:kern w:val="0"/>
           <w:sz w:val="20"/>
           <w:szCs w:val="20"/>
-        </w:rPr>
-      </w:pPr>
-      <w:r>
-        <w:rPr>
-          <w:rFonts w:ascii="Courier New" w:hAnsi="Courier New" w:cs="Courier New"/>
+          <w:lang w:val="en-US"/>
+        </w:rPr>
+      </w:pPr>
+      <w:r>
+        <w:rPr>
+          <w:rFonts w:ascii="Courier New" w:eastAsia="Times New Roman" w:hAnsi="Courier New" w:cs="Courier New"/>
+          <w:b w:val="0"/>
+          <w:bCs w:val="0"/>
+          <w:color w:val="auto"/>
+          <w:kern w:val="0"/>
           <w:sz w:val="20"/>
           <w:szCs w:val="20"/>
-        </w:rPr>
-        <w:t xml:space="preserve"> "</w:t>
+          <w:lang w:val="en-US"/>
+        </w:rPr>
+        <w:t xml:space="preserve">  "</w:t>
       </w:r>
       <w:proofErr w:type="gramStart"/>
       <w:r>
         <w:rPr>
-          <w:rFonts w:ascii="Courier New" w:hAnsi="Courier New" w:cs="Courier New"/>
+          <w:rFonts w:ascii="Courier New" w:eastAsia="Times New Roman" w:hAnsi="Courier New" w:cs="Courier New"/>
+          <w:b w:val="0"/>
+          <w:bCs w:val="0"/>
+          <w:color w:val="auto"/>
+          <w:kern w:val="0"/>
           <w:sz w:val="20"/>
           <w:szCs w:val="20"/>
-        </w:rPr>
-        <w:t>id</w:t>
+          <w:lang w:val="en-US"/>
+        </w:rPr>
+        <w:t>side</w:t>
       </w:r>
       <w:proofErr w:type="gramEnd"/>
       <w:r>
         <w:rPr>
-          <w:rFonts w:ascii="Courier New" w:hAnsi="Courier New" w:cs="Courier New"/>
+          <w:rFonts w:ascii="Courier New" w:eastAsia="Times New Roman" w:hAnsi="Courier New" w:cs="Courier New"/>
+          <w:b w:val="0"/>
+          <w:bCs w:val="0"/>
+          <w:color w:val="auto"/>
+          <w:kern w:val="0"/>
           <w:sz w:val="20"/>
           <w:szCs w:val="20"/>
-        </w:rPr>
-        <w:t>": "3fa85f64-5717-4562-b3fc-2c963f66afa6",</w:t>
+          <w:lang w:val="en-US"/>
+        </w:rPr>
+        <w:t>": 0,</w:t>
       </w:r>
     </w:p>
     <w:p>
       <w:pPr>
-        <w:pStyle w:val="NormalWeb"/>
-        <w:rPr>
-          <w:rFonts w:ascii="Courier New" w:hAnsi="Courier New" w:cs="Courier New"/>
+        <w:pStyle w:val="Heading1"/>
+        <w:rPr>
+          <w:rFonts w:ascii="Courier New" w:eastAsia="Times New Roman" w:hAnsi="Courier New" w:cs="Courier New"/>
+          <w:b w:val="0"/>
+          <w:bCs w:val="0"/>
+          <w:color w:val="auto"/>
+          <w:kern w:val="0"/>
           <w:sz w:val="20"/>
           <w:szCs w:val="20"/>
-        </w:rPr>
-      </w:pPr>
-      <w:r>
-        <w:rPr>
-          <w:rFonts w:ascii="Courier New" w:hAnsi="Courier New" w:cs="Courier New"/>
+          <w:lang w:val="en-US"/>
+        </w:rPr>
+      </w:pPr>
+      <w:r>
+        <w:rPr>
+          <w:rFonts w:ascii="Courier New" w:eastAsia="Times New Roman" w:hAnsi="Courier New" w:cs="Courier New"/>
+          <w:b w:val="0"/>
+          <w:bCs w:val="0"/>
+          <w:color w:val="auto"/>
+          <w:kern w:val="0"/>
           <w:sz w:val="20"/>
           <w:szCs w:val="20"/>
+          <w:lang w:val="en-US"/>
         </w:rPr>
         <w:t xml:space="preserve">  "</w:t>
       </w:r>
       <w:proofErr w:type="gramStart"/>
       <w:r>
         <w:rPr>
-          <w:rFonts w:ascii="Courier New" w:hAnsi="Courier New" w:cs="Courier New"/>
+          <w:rFonts w:ascii="Courier New" w:eastAsia="Times New Roman" w:hAnsi="Courier New" w:cs="Courier New"/>
+          <w:b w:val="0"/>
+          <w:bCs w:val="0"/>
+          <w:color w:val="auto"/>
+          <w:kern w:val="0"/>
           <w:sz w:val="20"/>
           <w:szCs w:val="20"/>
-        </w:rPr>
-        <w:t>symbol</w:t>
+          <w:lang w:val="en-US"/>
+        </w:rPr>
+        <w:t>price</w:t>
       </w:r>
       <w:proofErr w:type="gramEnd"/>
       <w:r>
         <w:rPr>
-          <w:rFonts w:ascii="Courier New" w:hAnsi="Courier New" w:cs="Courier New"/>
+          <w:rFonts w:ascii="Courier New" w:eastAsia="Times New Roman" w:hAnsi="Courier New" w:cs="Courier New"/>
+          <w:b w:val="0"/>
+          <w:bCs w:val="0"/>
+          <w:color w:val="auto"/>
+          <w:kern w:val="0"/>
           <w:sz w:val="20"/>
           <w:szCs w:val="20"/>
-        </w:rPr>
-        <w:t>": "QWR",</w:t>
+          <w:lang w:val="en-US"/>
+        </w:rPr>
+        <w:t>": 140,</w:t>
       </w:r>
     </w:p>
     <w:p>
       <w:pPr>
-        <w:pStyle w:val="NormalWeb"/>
-        <w:rPr>
-          <w:rFonts w:ascii="Courier New" w:hAnsi="Courier New" w:cs="Courier New"/>
+        <w:pStyle w:val="Heading1"/>
+        <w:rPr>
+          <w:rFonts w:ascii="Courier New" w:eastAsia="Times New Roman" w:hAnsi="Courier New" w:cs="Courier New"/>
+          <w:b w:val="0"/>
+          <w:bCs w:val="0"/>
+          <w:color w:val="auto"/>
+          <w:kern w:val="0"/>
           <w:sz w:val="20"/>
           <w:szCs w:val="20"/>
-        </w:rPr>
-      </w:pPr>
-      <w:r>
-        <w:rPr>
-          <w:rFonts w:ascii="Courier New" w:hAnsi="Courier New" w:cs="Courier New"/>
+          <w:lang w:val="en-US"/>
+        </w:rPr>
+      </w:pPr>
+      <w:r>
+        <w:rPr>
+          <w:rFonts w:ascii="Courier New" w:eastAsia="Times New Roman" w:hAnsi="Courier New" w:cs="Courier New"/>
+          <w:b w:val="0"/>
+          <w:bCs w:val="0"/>
+          <w:color w:val="auto"/>
+          <w:kern w:val="0"/>
           <w:sz w:val="20"/>
           <w:szCs w:val="20"/>
+          <w:lang w:val="en-US"/>
         </w:rPr>
         <w:t xml:space="preserve">  "</w:t>
       </w:r>
       <w:proofErr w:type="gramStart"/>
       <w:r>
         <w:rPr>
-          <w:rFonts w:ascii="Courier New" w:hAnsi="Courier New" w:cs="Courier New"/>
+          <w:rFonts w:ascii="Courier New" w:eastAsia="Times New Roman" w:hAnsi="Courier New" w:cs="Courier New"/>
+          <w:b w:val="0"/>
+          <w:bCs w:val="0"/>
+          <w:color w:val="auto"/>
+          <w:kern w:val="0"/>
           <w:sz w:val="20"/>
           <w:szCs w:val="20"/>
-        </w:rPr>
-        <w:t>side</w:t>
+          <w:lang w:val="en-US"/>
+        </w:rPr>
+        <w:t>quantity</w:t>
       </w:r>
       <w:proofErr w:type="gramEnd"/>
       <w:r>
         <w:rPr>
-          <w:rFonts w:ascii="Courier New" w:hAnsi="Courier New" w:cs="Courier New"/>
+          <w:rFonts w:ascii="Courier New" w:eastAsia="Times New Roman" w:hAnsi="Courier New" w:cs="Courier New"/>
+          <w:b w:val="0"/>
+          <w:bCs w:val="0"/>
+          <w:color w:val="auto"/>
+          <w:kern w:val="0"/>
           <w:sz w:val="20"/>
           <w:szCs w:val="20"/>
-        </w:rPr>
-        <w:t>": "Buy",</w:t>
+          <w:lang w:val="en-US"/>
+        </w:rPr>
+        <w:t>": 15,</w:t>
       </w:r>
     </w:p>
     <w:p>
       <w:pPr>
-        <w:pStyle w:val="NormalWeb"/>
-        <w:rPr>
-          <w:rFonts w:ascii="Courier New" w:hAnsi="Courier New" w:cs="Courier New"/>
+        <w:pStyle w:val="Heading1"/>
+        <w:rPr>
+          <w:rFonts w:ascii="Courier New" w:eastAsia="Times New Roman" w:hAnsi="Courier New" w:cs="Courier New"/>
+          <w:b w:val="0"/>
+          <w:bCs w:val="0"/>
+          <w:color w:val="auto"/>
+          <w:kern w:val="0"/>
           <w:sz w:val="20"/>
           <w:szCs w:val="20"/>
-        </w:rPr>
-      </w:pPr>
-      <w:r>
-        <w:rPr>
-          <w:rFonts w:ascii="Courier New" w:hAnsi="Courier New" w:cs="Courier New"/>
+          <w:lang w:val="en-US"/>
+        </w:rPr>
+      </w:pPr>
+      <w:r>
+        <w:rPr>
+          <w:rFonts w:ascii="Courier New" w:eastAsia="Times New Roman" w:hAnsi="Courier New" w:cs="Courier New"/>
+          <w:b w:val="0"/>
+          <w:bCs w:val="0"/>
+          <w:color w:val="auto"/>
+          <w:kern w:val="0"/>
           <w:sz w:val="20"/>
           <w:szCs w:val="20"/>
+          <w:lang w:val="en-US"/>
         </w:rPr>
         <w:t xml:space="preserve">  "</w:t>
       </w:r>
       <w:proofErr w:type="gramStart"/>
       <w:r>
         <w:rPr>
-          <w:rFonts w:ascii="Courier New" w:hAnsi="Courier New" w:cs="Courier New"/>
+          <w:rFonts w:ascii="Courier New" w:eastAsia="Times New Roman" w:hAnsi="Courier New" w:cs="Courier New"/>
+          <w:b w:val="0"/>
+          <w:bCs w:val="0"/>
+          <w:color w:val="auto"/>
+          <w:kern w:val="0"/>
           <w:sz w:val="20"/>
           <w:szCs w:val="20"/>
-        </w:rPr>
-        <w:t>price</w:t>
+          <w:lang w:val="en-US"/>
+        </w:rPr>
+        <w:t>timestamp</w:t>
       </w:r>
       <w:proofErr w:type="gramEnd"/>
       <w:r>
         <w:rPr>
-          <w:rFonts w:ascii="Courier New" w:hAnsi="Courier New" w:cs="Courier New"/>
+          <w:rFonts w:ascii="Courier New" w:eastAsia="Times New Roman" w:hAnsi="Courier New" w:cs="Courier New"/>
+          <w:b w:val="0"/>
+          <w:bCs w:val="0"/>
+          <w:color w:val="auto"/>
+          <w:kern w:val="0"/>
           <w:sz w:val="20"/>
           <w:szCs w:val="20"/>
-        </w:rPr>
-        <w:t>": 140,</w:t>
+          <w:lang w:val="en-US"/>
+        </w:rPr>
+        <w:t>": "2026-05-11T20:27:11.679Z",</w:t>
       </w:r>
     </w:p>
     <w:p>
       <w:pPr>
-        <w:pStyle w:val="NormalWeb"/>
-        <w:rPr>
-          <w:rFonts w:ascii="Courier New" w:hAnsi="Courier New" w:cs="Courier New"/>
+        <w:pStyle w:val="Heading1"/>
+        <w:rPr>
+          <w:rFonts w:ascii="Courier New" w:eastAsia="Times New Roman" w:hAnsi="Courier New" w:cs="Courier New"/>
+          <w:b w:val="0"/>
+          <w:bCs w:val="0"/>
+          <w:color w:val="auto"/>
+          <w:kern w:val="0"/>
           <w:sz w:val="20"/>
           <w:szCs w:val="20"/>
-        </w:rPr>
-      </w:pPr>
-      <w:r>
-        <w:rPr>
-          <w:rFonts w:ascii="Courier New" w:hAnsi="Courier New" w:cs="Courier New"/>
+          <w:lang w:val="en-US"/>
+        </w:rPr>
+      </w:pPr>
+      <w:r>
+        <w:rPr>
+          <w:rFonts w:ascii="Courier New" w:eastAsia="Times New Roman" w:hAnsi="Courier New" w:cs="Courier New"/>
+          <w:b w:val="0"/>
+          <w:bCs w:val="0"/>
+          <w:color w:val="auto"/>
+          <w:kern w:val="0"/>
           <w:sz w:val="20"/>
           <w:szCs w:val="20"/>
+          <w:lang w:val="en-US"/>
         </w:rPr>
         <w:t xml:space="preserve">  "</w:t>
       </w:r>
       <w:proofErr w:type="gramStart"/>
       <w:r>
         <w:rPr>
-          <w:rFonts w:ascii="Courier New" w:hAnsi="Courier New" w:cs="Courier New"/>
+          <w:rFonts w:ascii="Courier New" w:eastAsia="Times New Roman" w:hAnsi="Courier New" w:cs="Courier New"/>
+          <w:b w:val="0"/>
+          <w:bCs w:val="0"/>
+          <w:color w:val="auto"/>
+          <w:kern w:val="0"/>
           <w:sz w:val="20"/>
           <w:szCs w:val="20"/>
-        </w:rPr>
-        <w:t>quantity</w:t>
+          <w:lang w:val="en-US"/>
+        </w:rPr>
+        <w:t>status</w:t>
       </w:r>
       <w:proofErr w:type="gramEnd"/>
       <w:r>
         <w:rPr>
-          <w:rFonts w:ascii="Courier New" w:hAnsi="Courier New" w:cs="Courier New"/>
+          <w:rFonts w:ascii="Courier New" w:eastAsia="Times New Roman" w:hAnsi="Courier New" w:cs="Courier New"/>
+          <w:b w:val="0"/>
+          <w:bCs w:val="0"/>
+          <w:color w:val="auto"/>
+          <w:kern w:val="0"/>
           <w:sz w:val="20"/>
           <w:szCs w:val="20"/>
-        </w:rPr>
-        <w:t>": 15,</w:t>
+          <w:lang w:val="en-US"/>
+        </w:rPr>
+        <w:t>": 0,</w:t>
       </w:r>
     </w:p>
     <w:p>
       <w:pPr>
-        <w:pStyle w:val="NormalWeb"/>
-        <w:rPr>
-          <w:rFonts w:ascii="Courier New" w:hAnsi="Courier New" w:cs="Courier New"/>
+        <w:pStyle w:val="Heading1"/>
+        <w:rPr>
+          <w:rFonts w:ascii="Courier New" w:eastAsia="Times New Roman" w:hAnsi="Courier New" w:cs="Courier New"/>
+          <w:b w:val="0"/>
+          <w:bCs w:val="0"/>
+          <w:color w:val="auto"/>
+          <w:kern w:val="0"/>
           <w:sz w:val="20"/>
           <w:szCs w:val="20"/>
-        </w:rPr>
-      </w:pPr>
-      <w:r>
-        <w:rPr>
-          <w:rFonts w:ascii="Courier New" w:hAnsi="Courier New" w:cs="Courier New"/>
+          <w:lang w:val="en-US"/>
+        </w:rPr>
+      </w:pPr>
+      <w:r>
+        <w:rPr>
+          <w:rFonts w:ascii="Courier New" w:eastAsia="Times New Roman" w:hAnsi="Courier New" w:cs="Courier New"/>
+          <w:b w:val="0"/>
+          <w:bCs w:val="0"/>
+          <w:color w:val="auto"/>
+          <w:kern w:val="0"/>
           <w:sz w:val="20"/>
           <w:szCs w:val="20"/>
+          <w:lang w:val="en-US"/>
         </w:rPr>
         <w:t xml:space="preserve">  "</w:t>
       </w:r>
+      <w:proofErr w:type="spellStart"/>
       <w:proofErr w:type="gramStart"/>
       <w:r>
         <w:rPr>
-          <w:rFonts w:ascii="Courier New" w:hAnsi="Courier New" w:cs="Courier New"/>
+          <w:rFonts w:ascii="Courier New" w:eastAsia="Times New Roman" w:hAnsi="Courier New" w:cs="Courier New"/>
+          <w:b w:val="0"/>
+          <w:bCs w:val="0"/>
+          <w:color w:val="auto"/>
+          <w:kern w:val="0"/>
           <w:sz w:val="20"/>
           <w:szCs w:val="20"/>
-        </w:rPr>
-        <w:t>timestamp</w:t>
-      </w:r>
+          <w:lang w:val="en-US"/>
+        </w:rPr>
+        <w:t>originalQuantity</w:t>
+      </w:r>
+      <w:proofErr w:type="spellEnd"/>
       <w:proofErr w:type="gramEnd"/>
       <w:r>
         <w:rPr>
-          <w:rFonts w:ascii="Courier New" w:hAnsi="Courier New" w:cs="Courier New"/>
+          <w:rFonts w:ascii="Courier New" w:eastAsia="Times New Roman" w:hAnsi="Courier New" w:cs="Courier New"/>
+          <w:b w:val="0"/>
+          <w:bCs w:val="0"/>
+          <w:color w:val="auto"/>
+          <w:kern w:val="0"/>
           <w:sz w:val="20"/>
           <w:szCs w:val="20"/>
-        </w:rPr>
-        <w:t>": "2026-03-11T20:27:11.679Z"</w:t>
+          <w:lang w:val="en-US"/>
+        </w:rPr>
+        <w:t>": 15</w:t>
       </w:r>
     </w:p>
     <w:p>
       <w:pPr>
-        <w:pStyle w:val="NormalWeb"/>
-        <w:rPr>
-          <w:rFonts w:ascii="Courier New" w:hAnsi="Courier New" w:cs="Courier New"/>
+        <w:pStyle w:val="Heading1"/>
+        <w:rPr>
+          <w:rFonts w:ascii="Courier New" w:eastAsia="Times New Roman" w:hAnsi="Courier New" w:cs="Courier New"/>
+          <w:b w:val="0"/>
+          <w:bCs w:val="0"/>
+          <w:color w:val="auto"/>
+          <w:kern w:val="0"/>
           <w:sz w:val="20"/>
           <w:szCs w:val="20"/>
-        </w:rPr>
-      </w:pPr>
-      <w:r>
-        <w:rPr>
-          <w:rFonts w:ascii="Courier New" w:hAnsi="Courier New" w:cs="Courier New"/>
+          <w:lang w:val="en-US"/>
+        </w:rPr>
+      </w:pPr>
+      <w:r>
+        <w:rPr>
+          <w:rFonts w:ascii="Courier New" w:eastAsia="Times New Roman" w:hAnsi="Courier New" w:cs="Courier New"/>
+          <w:b w:val="0"/>
+          <w:bCs w:val="0"/>
+          <w:color w:val="auto"/>
+          <w:kern w:val="0"/>
           <w:sz w:val="20"/>
           <w:szCs w:val="20"/>
-        </w:rPr>
-        <w:t>}}</w:t>
+          <w:lang w:val="en-US"/>
+        </w:rPr>
+        <w:t>}</w:t>
       </w:r>
     </w:p>
     <w:p>
@@ -2521,7 +2480,6 @@
         <w:rPr>
           <w:rFonts w:ascii="MS Mincho" w:eastAsia="MS Mincho" w:hAnsi="MS Mincho" w:cs="MS Mincho" w:hint="eastAsia"/>
         </w:rPr>
-        <w:lastRenderedPageBreak/>
         <w:t>✔</w:t>
       </w:r>
       <w:r>
@@ -2569,223 +2527,11 @@
           <w:rStyle w:val="Strong"/>
         </w:rPr>
         <w:t>view all results from one API</w:t>
-      </w:r>
-      <w:r>
-        <w:t xml:space="preserve">, </w:t>
-      </w:r>
-    </w:p>
-    <w:p>
-      <w:pPr>
-        <w:spacing w:before="100" w:beforeAutospacing="1" w:after="100" w:afterAutospacing="1" w:line="240" w:lineRule="auto"/>
-        <w:rPr>
-          <w:rFonts w:ascii="Times New Roman" w:eastAsia="Times New Roman" w:hAnsi="Times New Roman" w:cs="Times New Roman"/>
-          <w:kern w:val="0"/>
-          <w:sz w:val="24"/>
-          <w:szCs w:val="24"/>
-          <w:lang w:val="en-US"/>
-        </w:rPr>
-      </w:pPr>
-      <w:r>
-        <w:rPr>
-          <w:rFonts w:ascii="Times New Roman" w:eastAsia="Times New Roman" w:hAnsi="Times New Roman" w:cs="Times New Roman"/>
-          <w:kern w:val="0"/>
-          <w:sz w:val="24"/>
-          <w:szCs w:val="24"/>
-          <w:lang w:val="en-US"/>
-        </w:rPr>
-        <w:t>🔥 Why this impresses: Strong system design + scalable thinking.</w:t>
-      </w:r>
-    </w:p>
-    <w:p>
-      <w:pPr>
-        <w:pStyle w:val="NormalWeb"/>
-        <w:numPr>
-          <w:ilvl w:val="0"/>
-          <w:numId w:val="10"/>
-        </w:numPr>
-      </w:pPr>
-      <w:r>
-        <w:rPr>
-          <w:rStyle w:val="Strong"/>
-        </w:rPr>
-        <w:t>.NET (C#, ASP.NET Core, Web API)</w:t>
-      </w:r>
-    </w:p>
-    <w:p>
-      <w:pPr>
-        <w:pStyle w:val="NormalWeb"/>
-        <w:numPr>
-          <w:ilvl w:val="0"/>
-          <w:numId w:val="10"/>
-        </w:numPr>
-      </w:pPr>
-      <w:r>
-        <w:rPr>
-          <w:rStyle w:val="Strong"/>
-        </w:rPr>
-        <w:t>Cloud (Azure / AWS)</w:t>
-      </w:r>
-    </w:p>
-    <w:p>
-      <w:pPr>
-        <w:pStyle w:val="NormalWeb"/>
-        <w:numPr>
-          <w:ilvl w:val="0"/>
-          <w:numId w:val="10"/>
-        </w:numPr>
-      </w:pPr>
-      <w:r>
-        <w:rPr>
-          <w:rStyle w:val="Strong"/>
-        </w:rPr>
-        <w:t>AI integration (LLMs, RAG, agents)</w:t>
-      </w:r>
-    </w:p>
-    <w:p>
-      <w:pPr>
-        <w:pStyle w:val="NormalWeb"/>
-        <w:numPr>
-          <w:ilvl w:val="0"/>
-          <w:numId w:val="10"/>
-        </w:numPr>
-      </w:pPr>
-      <w:proofErr w:type="spellStart"/>
-      <w:r>
-        <w:rPr>
-          <w:rStyle w:val="Strong"/>
-        </w:rPr>
-        <w:t>Microservices</w:t>
-      </w:r>
-      <w:proofErr w:type="spellEnd"/>
-      <w:r>
-        <w:rPr>
-          <w:rStyle w:val="Strong"/>
-        </w:rPr>
-        <w:t xml:space="preserve"> &amp; scalable architecture</w:t>
-      </w:r>
-    </w:p>
-    <w:p>
-      <w:pPr>
-        <w:pStyle w:val="NormalWeb"/>
-        <w:numPr>
-          <w:ilvl w:val="0"/>
-          <w:numId w:val="10"/>
-        </w:numPr>
-      </w:pPr>
-      <w:r>
-        <w:rPr>
-          <w:rStyle w:val="Strong"/>
-        </w:rPr>
-        <w:t>Real production-style projects</w:t>
-      </w:r>
-    </w:p>
-    <w:p>
-      <w:pPr>
-        <w:pStyle w:val="NormalWeb"/>
-      </w:pPr>
-      <w:r>
-        <w:t xml:space="preserve">Projects that </w:t>
-      </w:r>
-      <w:r>
-        <w:rPr>
-          <w:rStyle w:val="Strong"/>
-        </w:rPr>
-        <w:t>combine .NET + AI + cloud + real business use cases</w:t>
-      </w:r>
-      <w:r>
-        <w:t xml:space="preserve"> stand out the most.</w:t>
-      </w:r>
-    </w:p>
-    <w:p>
-      <w:pPr>
-        <w:pStyle w:val="Heading1"/>
-        <w:rPr>
-          <w:sz w:val="36"/>
-        </w:rPr>
-      </w:pPr>
-      <w:r>
-        <w:rPr>
-          <w:sz w:val="36"/>
-        </w:rPr>
-        <w:t xml:space="preserve">AI </w:t>
-      </w:r>
-      <w:proofErr w:type="spellStart"/>
-      <w:r>
-        <w:rPr>
-          <w:sz w:val="36"/>
-        </w:rPr>
-        <w:t>SaaS</w:t>
-      </w:r>
-      <w:proofErr w:type="spellEnd"/>
-      <w:r>
-        <w:rPr>
-          <w:sz w:val="36"/>
-        </w:rPr>
-        <w:t>: Meeting Summarizer for Teams/Zoom</w:t>
-      </w:r>
-    </w:p>
-    <w:p>
-      <w:pPr>
-        <w:pStyle w:val="NormalWeb"/>
-      </w:pPr>
-      <w:r>
-        <w:t>The system:</w:t>
-      </w:r>
-      <w:r>
-        <w:t xml:space="preserve"> </w:t>
-      </w:r>
-      <w:r>
-        <w:t xml:space="preserve">Converts </w:t>
-      </w:r>
-      <w:r>
-        <w:rPr>
-          <w:rStyle w:val="Strong"/>
-        </w:rPr>
-        <w:t>audio → text</w:t>
-      </w:r>
-      <w:r>
-        <w:t xml:space="preserve"> then </w:t>
-      </w:r>
-      <w:r>
-        <w:t xml:space="preserve">Uses </w:t>
-      </w:r>
-      <w:r>
-        <w:rPr>
-          <w:rStyle w:val="Strong"/>
-        </w:rPr>
-        <w:t>AI to summarize</w:t>
-      </w:r>
-      <w:r>
-        <w:rPr>
-          <w:rStyle w:val="Strong"/>
-        </w:rPr>
-        <w:t xml:space="preserve"> and e</w:t>
-      </w:r>
-      <w:r>
-        <w:t xml:space="preserve">xtracts </w:t>
-      </w:r>
-      <w:r>
-        <w:rPr>
-          <w:rStyle w:val="Strong"/>
-        </w:rPr>
-        <w:t>action items</w:t>
-      </w:r>
-      <w:r>
-        <w:t xml:space="preserve"> and </w:t>
-      </w:r>
-      <w:r>
-        <w:t>Stores meeting summary</w:t>
-      </w:r>
-      <w:r>
-        <w:t xml:space="preserve"> later </w:t>
-      </w:r>
-      <w:r>
-        <w:t>Shows it in dashboard</w:t>
       </w:r>
     </w:p>
     <w:sectPr>
       <w:pgSz w:w="11906" w:h="16838"/>
-      <w:pgMar w:top="1440" w:right="1440" w:bottom="1440" w:left="1440" w:header="708" w:footer="708" w:gutter="0"/>
+      <w:pgMar w:top="720" w:right="720" w:bottom="720" w:left="720" w:header="708" w:footer="708" w:gutter="0"/>
       <w:cols w:space="708"/>
       <w:docGrid w:linePitch="360"/>
     </w:sectPr>
@@ -6344,7 +6090,7 @@
   <a:extraClrSchemeLst/>
   <a:extLst>
     <a:ext uri="{05A4C25C-085E-4340-85A3-A5531E510DB2}">
-      <thm15:themeFamily xmlns:thm15="http://schemas.microsoft.com/office/thememl/2012/main" xmlns="" name="Office Theme" id="{62F939B6-93AF-4DB8-9C6B-D6C7DFDC589F}" vid="{4A3C46E8-61CC-4603-A589-7422A47A8E4A}"/>
+      <thm15:themeFamily xmlns="" xmlns:thm15="http://schemas.microsoft.com/office/thememl/2012/main" name="Office Theme" id="{62F939B6-93AF-4DB8-9C6B-D6C7DFDC589F}" vid="{4A3C46E8-61CC-4603-A589-7422A47A8E4A}"/>
     </a:ext>
   </a:extLst>
 </a:theme>

</xml_diff>